<commit_message>
Spanish full-count film, the Spanish On the scanner booklet, and the training prints
- The Spanish film on the newest gun, its shots, and the pictures for
  the Spanish On the scanner pages
- En el escáner printed: 23 pages and the contents, each on one sheet
- Pocket cards, wall, roster, check-off, quiz and word list re-rendered

Co-Authored-By: Claude Opus 5.5 <noreply@anthropic.com>
Claude-Session: https://claude.ai/code/session_01LaCZ626Y2oWoWchJeisbmg
</commit_message>
<xml_diff>
--- a/docs/training/print/en-el-escaner.docx
+++ b/docs/training/print/en-el-escaner.docx
@@ -306,10 +306,10 @@
         <w:rPr>
           <w:b/>
         </w:rPr>
-        <w:t xml:space="preserve">Un lote o una fecha de caducidad</w:t>
-      </w:r>
-      <w:r>
-        <w:t xml:space="preserve"> — el conteo pide también el lote o la fecha de caducidad</w:t>
+        <w:t xml:space="preserve">Un lote o una fecha de vencimiento</w:t>
+      </w:r>
+      <w:r>
+        <w:t xml:space="preserve"> — el conteo pide también el lote o la fecha de vencimiento</w:t>
       </w:r>
     </w:p>
     <w:p>
@@ -555,11 +555,41 @@
           </w:tcPr>
           <w:p>
             <w:pPr>
-              <w:spacing w:before="0" w:after="60" w:line="240" w:lineRule="auto"/>
-              <w:jc w:val="left"/>
+              <w:spacing w:before="0" w:after="0"/>
+              <w:jc w:val="center"/>
             </w:pPr>
             <w:r>
-              <w:t xml:space="preserve"/>
+              <w:drawing>
+                <wp:inline distT="0" distB="0" distL="0" distR="0">
+                  <wp:extent cx="1350662" cy="2377440"/>
+                  <wp:docPr id="1" name="../../../images/scanner-film-multi-label-button-es.png"/>
+                  <a:graphic xmlns:a="http://schemas.openxmlformats.org/drawingml/2006/main">
+                    <a:graphicData uri="http://schemas.openxmlformats.org/drawingml/2006/picture">
+                      <pic:pic xmlns:pic="http://schemas.openxmlformats.org/drawingml/2006/picture">
+                        <pic:nvPicPr>
+                          <pic:cNvPr id="1" name="../../../images/scanner-film-multi-label-button-es.png"/>
+                          <pic:cNvPicPr/>
+                        </pic:nvPicPr>
+                        <pic:blipFill>
+                          <a:blip r:embed="rIdImg1"/>
+                          <a:stretch>
+                            <a:fillRect/>
+                          </a:stretch>
+                        </pic:blipFill>
+                        <pic:spPr>
+                          <a:xfrm>
+                            <a:off x="0" y="0"/>
+                            <a:ext cx="1350662" cy="2377440"/>
+                          </a:xfrm>
+                          <a:prstGeom prst="rect">
+                            <a:avLst/>
+                          </a:prstGeom>
+                        </pic:spPr>
+                      </pic:pic>
+                    </a:graphicData>
+                  </a:graphic>
+                </wp:inline>
+              </w:drawing>
             </w:r>
           </w:p>
           <w:p>
@@ -584,11 +614,41 @@
           </w:tcPr>
           <w:p>
             <w:pPr>
-              <w:spacing w:before="0" w:after="60" w:line="240" w:lineRule="auto"/>
-              <w:jc w:val="left"/>
+              <w:spacing w:before="0" w:after="0"/>
+              <w:jc w:val="center"/>
             </w:pPr>
             <w:r>
-              <w:t xml:space="preserve"/>
+              <w:drawing>
+                <wp:inline distT="0" distB="0" distL="0" distR="0">
+                  <wp:extent cx="1350662" cy="2377440"/>
+                  <wp:docPr id="2" name="../../../images/scanner-film-multi-label-2-es.png"/>
+                  <a:graphic xmlns:a="http://schemas.openxmlformats.org/drawingml/2006/main">
+                    <a:graphicData uri="http://schemas.openxmlformats.org/drawingml/2006/picture">
+                      <pic:pic xmlns:pic="http://schemas.openxmlformats.org/drawingml/2006/picture">
+                        <pic:nvPicPr>
+                          <pic:cNvPr id="2" name="../../../images/scanner-film-multi-label-2-es.png"/>
+                          <pic:cNvPicPr/>
+                        </pic:nvPicPr>
+                        <pic:blipFill>
+                          <a:blip r:embed="rIdImg2"/>
+                          <a:stretch>
+                            <a:fillRect/>
+                          </a:stretch>
+                        </pic:blipFill>
+                        <pic:spPr>
+                          <a:xfrm>
+                            <a:off x="0" y="0"/>
+                            <a:ext cx="1350662" cy="2377440"/>
+                          </a:xfrm>
+                          <a:prstGeom prst="rect">
+                            <a:avLst/>
+                          </a:prstGeom>
+                        </pic:spPr>
+                      </pic:pic>
+                    </a:graphicData>
+                  </a:graphic>
+                </wp:inline>
+              </w:drawing>
             </w:r>
           </w:p>
           <w:p>
@@ -613,11 +673,41 @@
           </w:tcPr>
           <w:p>
             <w:pPr>
-              <w:spacing w:before="0" w:after="60" w:line="240" w:lineRule="auto"/>
-              <w:jc w:val="left"/>
+              <w:spacing w:before="0" w:after="0"/>
+              <w:jc w:val="center"/>
             </w:pPr>
             <w:r>
-              <w:t xml:space="preserve"/>
+              <w:drawing>
+                <wp:inline distT="0" distB="0" distL="0" distR="0">
+                  <wp:extent cx="1350662" cy="2377440"/>
+                  <wp:docPr id="3" name="../../../images/scanner-film-multi-label-done-es.png"/>
+                  <a:graphic xmlns:a="http://schemas.openxmlformats.org/drawingml/2006/main">
+                    <a:graphicData uri="http://schemas.openxmlformats.org/drawingml/2006/picture">
+                      <pic:pic xmlns:pic="http://schemas.openxmlformats.org/drawingml/2006/picture">
+                        <pic:nvPicPr>
+                          <pic:cNvPr id="3" name="../../../images/scanner-film-multi-label-done-es.png"/>
+                          <pic:cNvPicPr/>
+                        </pic:nvPicPr>
+                        <pic:blipFill>
+                          <a:blip r:embed="rIdImg3"/>
+                          <a:stretch>
+                            <a:fillRect/>
+                          </a:stretch>
+                        </pic:blipFill>
+                        <pic:spPr>
+                          <a:xfrm>
+                            <a:off x="0" y="0"/>
+                            <a:ext cx="1350662" cy="2377440"/>
+                          </a:xfrm>
+                          <a:prstGeom prst="rect">
+                            <a:avLst/>
+                          </a:prstGeom>
+                        </pic:spPr>
+                      </pic:pic>
+                    </a:graphicData>
+                  </a:graphic>
+                </wp:inline>
+              </w:drawing>
             </w:r>
           </w:p>
           <w:p>
@@ -967,16 +1057,16 @@
               <w:drawing>
                 <wp:inline distT="0" distB="0" distL="0" distR="0">
                   <wp:extent cx="1035507" cy="2377440"/>
-                  <wp:docPr id="1" name="../../../images/scanner-label-will-not-scan-es.png"/>
+                  <wp:docPr id="4" name="../../../images/scanner-label-will-not-scan-es.png"/>
                   <a:graphic xmlns:a="http://schemas.openxmlformats.org/drawingml/2006/main">
                     <a:graphicData uri="http://schemas.openxmlformats.org/drawingml/2006/picture">
                       <pic:pic xmlns:pic="http://schemas.openxmlformats.org/drawingml/2006/picture">
                         <pic:nvPicPr>
-                          <pic:cNvPr id="1" name="../../../images/scanner-label-will-not-scan-es.png"/>
+                          <pic:cNvPr id="4" name="../../../images/scanner-label-will-not-scan-es.png"/>
                           <pic:cNvPicPr/>
                         </pic:nvPicPr>
                         <pic:blipFill>
-                          <a:blip r:embed="rIdImg1"/>
+                          <a:blip r:embed="rIdImg4"/>
                           <a:stretch>
                             <a:fillRect/>
                           </a:stretch>
@@ -1026,16 +1116,16 @@
               <w:drawing>
                 <wp:inline distT="0" distB="0" distL="0" distR="0">
                   <wp:extent cx="1035507" cy="2377440"/>
-                  <wp:docPr id="2" name="../../../images/scanner-label-typed-es.png"/>
+                  <wp:docPr id="5" name="../../../images/scanner-label-typed-es.png"/>
                   <a:graphic xmlns:a="http://schemas.openxmlformats.org/drawingml/2006/main">
                     <a:graphicData uri="http://schemas.openxmlformats.org/drawingml/2006/picture">
                       <pic:pic xmlns:pic="http://schemas.openxmlformats.org/drawingml/2006/picture">
                         <pic:nvPicPr>
-                          <pic:cNvPr id="2" name="../../../images/scanner-label-typed-es.png"/>
+                          <pic:cNvPr id="5" name="../../../images/scanner-label-typed-es.png"/>
                           <pic:cNvPicPr/>
                         </pic:nvPicPr>
                         <pic:blipFill>
-                          <a:blip r:embed="rIdImg2"/>
+                          <a:blip r:embed="rIdImg5"/>
                           <a:stretch>
                             <a:fillRect/>
                           </a:stretch>
@@ -1241,19 +1331,19 @@
         <w:rPr>
           <w:b/>
         </w:rPr>
-        <w:t xml:space="preserve">Reportes → Lista de arreglos</w:t>
-      </w:r>
-      <w:r>
-        <w:t xml:space="preserve">, en </w:t>
+        <w:t xml:space="preserve">Reports → Fix list</w:t>
+      </w:r>
+      <w:r>
+        <w:t xml:space="preserve"> (la lista de arreglos), en </w:t>
       </w:r>
       <w:r>
         <w:rPr>
           <w:i/>
         </w:rPr>
-        <w:t xml:space="preserve">Etiquetas por cambiar</w:t>
-      </w:r>
-      <w:r>
-        <w:t xml:space="preserve">. Cuando la etiqueta nueva está impresa y puesta, la oficina toca </w:t>
+        <w:t xml:space="preserve">Labels to replace</w:t>
+      </w:r>
+      <w:r>
+        <w:t xml:space="preserve"> (etiquetas por cambiar). Cuando la etiqueta nueva está impresa y puesta, la oficina toca </w:t>
       </w:r>
       <w:r>
         <w:rPr>
@@ -1395,16 +1485,16 @@
         <w:drawing>
           <wp:inline distT="0" distB="0" distL="0" distR="0">
             <wp:extent cx="1035507" cy="2377440"/>
-            <wp:docPr id="3" name="../../../images/scanner-no-label-es.png"/>
+            <wp:docPr id="6" name="../../../images/scanner-no-label-es.png"/>
             <a:graphic xmlns:a="http://schemas.openxmlformats.org/drawingml/2006/main">
               <a:graphicData uri="http://schemas.openxmlformats.org/drawingml/2006/picture">
                 <pic:pic xmlns:pic="http://schemas.openxmlformats.org/drawingml/2006/picture">
                   <pic:nvPicPr>
-                    <pic:cNvPr id="3" name="../../../images/scanner-no-label-es.png"/>
+                    <pic:cNvPr id="6" name="../../../images/scanner-no-label-es.png"/>
                     <pic:cNvPicPr/>
                   </pic:nvPicPr>
                   <pic:blipFill>
-                    <a:blip r:embed="rIdImg3"/>
+                    <a:blip r:embed="rIdImg6"/>
                     <a:stretch>
                       <a:fillRect/>
                     </a:stretch>
@@ -1612,19 +1702,19 @@
         <w:rPr>
           <w:b/>
         </w:rPr>
-        <w:t xml:space="preserve">Reportes → Lista de arreglos</w:t>
-      </w:r>
-      <w:r>
-        <w:t xml:space="preserve"> en </w:t>
+        <w:t xml:space="preserve">Reports → Fix list</w:t>
+      </w:r>
+      <w:r>
+        <w:t xml:space="preserve"> (la lista de arreglos) en </w:t>
       </w:r>
       <w:r>
         <w:rPr>
           <w:i/>
         </w:rPr>
-        <w:t xml:space="preserve">Etiquetas por cambiar</w:t>
-      </w:r>
-      <w:r>
-        <w:t xml:space="preserve">, y la oficina la compara con lo que el reporte esperaba ahí.</w:t>
+        <w:t xml:space="preserve">Labels to replace</w:t>
+      </w:r>
+      <w:r>
+        <w:t xml:space="preserve"> (etiquetas por cambiar), y la oficina la compara con lo que el reporte esperaba ahí.</w:t>
       </w:r>
     </w:p>
     <w:p>
@@ -1779,16 +1869,16 @@
               <w:drawing>
                 <wp:inline distT="0" distB="0" distL="0" distR="0">
                   <wp:extent cx="1035507" cy="2377440"/>
-                  <wp:docPr id="4" name="../../../images/scanner-bin-label-will-not-scan-es.png"/>
+                  <wp:docPr id="7" name="../../../images/scanner-bin-label-will-not-scan-es.png"/>
                   <a:graphic xmlns:a="http://schemas.openxmlformats.org/drawingml/2006/main">
                     <a:graphicData uri="http://schemas.openxmlformats.org/drawingml/2006/picture">
                       <pic:pic xmlns:pic="http://schemas.openxmlformats.org/drawingml/2006/picture">
                         <pic:nvPicPr>
-                          <pic:cNvPr id="4" name="../../../images/scanner-bin-label-will-not-scan-es.png"/>
+                          <pic:cNvPr id="7" name="../../../images/scanner-bin-label-will-not-scan-es.png"/>
                           <pic:cNvPicPr/>
                         </pic:nvPicPr>
                         <pic:blipFill>
-                          <a:blip r:embed="rIdImg4"/>
+                          <a:blip r:embed="rIdImg7"/>
                           <a:stretch>
                             <a:fillRect/>
                           </a:stretch>
@@ -1838,16 +1928,16 @@
               <w:drawing>
                 <wp:inline distT="0" distB="0" distL="0" distR="0">
                   <wp:extent cx="1035507" cy="2377440"/>
-                  <wp:docPr id="5" name="../../../images/scanner-bin-label-assumed-es.png"/>
+                  <wp:docPr id="8" name="../../../images/scanner-bin-label-assumed-es.png"/>
                   <a:graphic xmlns:a="http://schemas.openxmlformats.org/drawingml/2006/main">
                     <a:graphicData uri="http://schemas.openxmlformats.org/drawingml/2006/picture">
                       <pic:pic xmlns:pic="http://schemas.openxmlformats.org/drawingml/2006/picture">
                         <pic:nvPicPr>
-                          <pic:cNvPr id="5" name="../../../images/scanner-bin-label-assumed-es.png"/>
+                          <pic:cNvPr id="8" name="../../../images/scanner-bin-label-assumed-es.png"/>
                           <pic:cNvPicPr/>
                         </pic:nvPicPr>
                         <pic:blipFill>
-                          <a:blip r:embed="rIdImg5"/>
+                          <a:blip r:embed="rIdImg8"/>
                           <a:stretch>
                             <a:fillRect/>
                           </a:stretch>
@@ -2059,19 +2149,19 @@
         <w:rPr>
           <w:b/>
         </w:rPr>
-        <w:t xml:space="preserve">Reportes → Lista de arreglos</w:t>
-      </w:r>
-      <w:r>
-        <w:t xml:space="preserve"> en </w:t>
+        <w:t xml:space="preserve">Reports → Fix list</w:t>
+      </w:r>
+      <w:r>
+        <w:t xml:space="preserve"> (la lista de arreglos) en </w:t>
       </w:r>
       <w:r>
         <w:rPr>
           <w:i/>
         </w:rPr>
-        <w:t xml:space="preserve">Etiquetas por cambiar</w:t>
-      </w:r>
-      <w:r>
-        <w:t xml:space="preserve">, uses el botón que uses. Cuando la etiqueta nueva está puesta, la oficina toca </w:t>
+        <w:t xml:space="preserve">Labels to replace</w:t>
+      </w:r>
+      <w:r>
+        <w:t xml:space="preserve"> (etiquetas por cambiar), uses el botón que uses. Cuando la etiqueta nueva está puesta, la oficina toca </w:t>
       </w:r>
       <w:r>
         <w:rPr>
@@ -2200,16 +2290,16 @@
         <w:drawing>
           <wp:inline distT="0" distB="0" distL="0" distR="0">
             <wp:extent cx="1035507" cy="2377440"/>
-            <wp:docPr id="6" name="../../../images/scanner-still-in-bin-es.png"/>
+            <wp:docPr id="9" name="../../../images/scanner-still-in-bin-es.png"/>
             <a:graphic xmlns:a="http://schemas.openxmlformats.org/drawingml/2006/main">
               <a:graphicData uri="http://schemas.openxmlformats.org/drawingml/2006/picture">
                 <pic:pic xmlns:pic="http://schemas.openxmlformats.org/drawingml/2006/picture">
                   <pic:nvPicPr>
-                    <pic:cNvPr id="6" name="../../../images/scanner-still-in-bin-es.png"/>
+                    <pic:cNvPr id="9" name="../../../images/scanner-still-in-bin-es.png"/>
                     <pic:cNvPicPr/>
                   </pic:nvPicPr>
                   <pic:blipFill>
-                    <a:blip r:embed="rIdImg6"/>
+                    <a:blip r:embed="rIdImg9"/>
                     <a:stretch>
                       <a:fillRect/>
                     </a:stretch>
@@ -2526,16 +2616,16 @@
         <w:drawing>
           <wp:inline distT="0" distB="0" distL="0" distR="0">
             <wp:extent cx="1035507" cy="2377440"/>
-            <wp:docPr id="7" name="../../../images/scanner-empty-bin-es.png"/>
+            <wp:docPr id="10" name="../../../images/scanner-empty-bin-es.png"/>
             <a:graphic xmlns:a="http://schemas.openxmlformats.org/drawingml/2006/main">
               <a:graphicData uri="http://schemas.openxmlformats.org/drawingml/2006/picture">
                 <pic:pic xmlns:pic="http://schemas.openxmlformats.org/drawingml/2006/picture">
                   <pic:nvPicPr>
-                    <pic:cNvPr id="7" name="../../../images/scanner-empty-bin-es.png"/>
+                    <pic:cNvPr id="10" name="../../../images/scanner-empty-bin-es.png"/>
                     <pic:cNvPicPr/>
                   </pic:nvPicPr>
                   <pic:blipFill>
-                    <a:blip r:embed="rIdImg7"/>
+                    <a:blip r:embed="rIdImg10"/>
                     <a:stretch>
                       <a:fillRect/>
                     </a:stretch>
@@ -2881,16 +2971,16 @@
               <w:drawing>
                 <wp:inline distT="0" distB="0" distL="0" distR="0">
                   <wp:extent cx="1035507" cy="2377440"/>
-                  <wp:docPr id="8" name="../../../images/scanner-empty-run-first-es.png"/>
+                  <wp:docPr id="11" name="../../../images/scanner-empty-run-first-es.png"/>
                   <a:graphic xmlns:a="http://schemas.openxmlformats.org/drawingml/2006/main">
                     <a:graphicData uri="http://schemas.openxmlformats.org/drawingml/2006/picture">
                       <pic:pic xmlns:pic="http://schemas.openxmlformats.org/drawingml/2006/picture">
                         <pic:nvPicPr>
-                          <pic:cNvPr id="8" name="../../../images/scanner-empty-run-first-es.png"/>
+                          <pic:cNvPr id="11" name="../../../images/scanner-empty-run-first-es.png"/>
                           <pic:cNvPicPr/>
                         </pic:nvPicPr>
                         <pic:blipFill>
-                          <a:blip r:embed="rIdImg8"/>
+                          <a:blip r:embed="rIdImg11"/>
                           <a:stretch>
                             <a:fillRect/>
                           </a:stretch>
@@ -2940,16 +3030,16 @@
               <w:drawing>
                 <wp:inline distT="0" distB="0" distL="0" distR="0">
                   <wp:extent cx="1035507" cy="2377440"/>
-                  <wp:docPr id="9" name="../../../images/scanner-empty-run-es.png"/>
+                  <wp:docPr id="12" name="../../../images/scanner-empty-run-es.png"/>
                   <a:graphic xmlns:a="http://schemas.openxmlformats.org/drawingml/2006/main">
                     <a:graphicData uri="http://schemas.openxmlformats.org/drawingml/2006/picture">
                       <pic:pic xmlns:pic="http://schemas.openxmlformats.org/drawingml/2006/picture">
                         <pic:nvPicPr>
-                          <pic:cNvPr id="9" name="../../../images/scanner-empty-run-es.png"/>
+                          <pic:cNvPr id="12" name="../../../images/scanner-empty-run-es.png"/>
                           <pic:cNvPicPr/>
                         </pic:nvPicPr>
                         <pic:blipFill>
-                          <a:blip r:embed="rIdImg9"/>
+                          <a:blip r:embed="rIdImg12"/>
                           <a:stretch>
                             <a:fillRect/>
                           </a:stretch>
@@ -3300,16 +3390,16 @@
         <w:drawing>
           <wp:inline distT="0" distB="0" distL="0" distR="0">
             <wp:extent cx="1035507" cy="2377440"/>
-            <wp:docPr id="10" name="../../../images/scanner-not-on-list-es.png"/>
+            <wp:docPr id="13" name="../../../images/scanner-not-on-list-es.png"/>
             <a:graphic xmlns:a="http://schemas.openxmlformats.org/drawingml/2006/main">
               <a:graphicData uri="http://schemas.openxmlformats.org/drawingml/2006/picture">
                 <pic:pic xmlns:pic="http://schemas.openxmlformats.org/drawingml/2006/picture">
                   <pic:nvPicPr>
-                    <pic:cNvPr id="10" name="../../../images/scanner-not-on-list-es.png"/>
+                    <pic:cNvPr id="13" name="../../../images/scanner-not-on-list-es.png"/>
                     <pic:cNvPicPr/>
                   </pic:nvPicPr>
                   <pic:blipFill>
-                    <a:blip r:embed="rIdImg10"/>
+                    <a:blip r:embed="rIdImg13"/>
                     <a:stretch>
                       <a:fillRect/>
                     </a:stretch>
@@ -3619,16 +3709,16 @@
         <w:drawing>
           <wp:inline distT="0" distB="0" distL="0" distR="0">
             <wp:extent cx="1035507" cy="2377440"/>
-            <wp:docPr id="11" name="../../../images/scanner-bin-not-on-list-es.png"/>
+            <wp:docPr id="14" name="../../../images/scanner-bin-not-on-list-es.png"/>
             <a:graphic xmlns:a="http://schemas.openxmlformats.org/drawingml/2006/main">
               <a:graphicData uri="http://schemas.openxmlformats.org/drawingml/2006/picture">
                 <pic:pic xmlns:pic="http://schemas.openxmlformats.org/drawingml/2006/picture">
                   <pic:nvPicPr>
-                    <pic:cNvPr id="11" name="../../../images/scanner-bin-not-on-list-es.png"/>
+                    <pic:cNvPr id="14" name="../../../images/scanner-bin-not-on-list-es.png"/>
                     <pic:cNvPicPr/>
                   </pic:nvPicPr>
                   <pic:blipFill>
-                    <a:blip r:embed="rIdImg11"/>
+                    <a:blip r:embed="rIdImg14"/>
                     <a:stretch>
                       <a:fillRect/>
                     </a:stretch>
@@ -3923,16 +4013,16 @@
         <w:drawing>
           <wp:inline distT="0" distB="0" distL="0" distR="0">
             <wp:extent cx="1035507" cy="2377440"/>
-            <wp:docPr id="12" name="../../../images/scanner-already-counted-es.png"/>
+            <wp:docPr id="15" name="../../../images/scanner-already-counted-es.png"/>
             <a:graphic xmlns:a="http://schemas.openxmlformats.org/drawingml/2006/main">
               <a:graphicData uri="http://schemas.openxmlformats.org/drawingml/2006/picture">
                 <pic:pic xmlns:pic="http://schemas.openxmlformats.org/drawingml/2006/picture">
                   <pic:nvPicPr>
-                    <pic:cNvPr id="12" name="../../../images/scanner-already-counted-es.png"/>
+                    <pic:cNvPr id="15" name="../../../images/scanner-already-counted-es.png"/>
                     <pic:cNvPicPr/>
                   </pic:nvPicPr>
                   <pic:blipFill>
-                    <a:blip r:embed="rIdImg12"/>
+                    <a:blip r:embed="rIdImg15"/>
                     <a:stretch>
                       <a:fillRect/>
                     </a:stretch>
@@ -4245,16 +4335,16 @@
               <w:drawing>
                 <wp:inline distT="0" distB="0" distL="0" distR="0">
                   <wp:extent cx="1035507" cy="2377440"/>
-                  <wp:docPr id="13" name="../../../images/scanner-not-your-level-es.png"/>
+                  <wp:docPr id="16" name="../../../images/scanner-not-your-level-es.png"/>
                   <a:graphic xmlns:a="http://schemas.openxmlformats.org/drawingml/2006/main">
                     <a:graphicData uri="http://schemas.openxmlformats.org/drawingml/2006/picture">
                       <pic:pic xmlns:pic="http://schemas.openxmlformats.org/drawingml/2006/picture">
                         <pic:nvPicPr>
-                          <pic:cNvPr id="13" name="../../../images/scanner-not-your-level-es.png"/>
+                          <pic:cNvPr id="16" name="../../../images/scanner-not-your-level-es.png"/>
                           <pic:cNvPicPr/>
                         </pic:nvPicPr>
                         <pic:blipFill>
-                          <a:blip r:embed="rIdImg13"/>
+                          <a:blip r:embed="rIdImg16"/>
                           <a:stretch>
                             <a:fillRect/>
                           </a:stretch>
@@ -4304,16 +4394,16 @@
               <w:drawing>
                 <wp:inline distT="0" distB="0" distL="0" distR="0">
                   <wp:extent cx="1035507" cy="2377440"/>
-                  <wp:docPr id="14" name="../../../images/scanner-not-your-aisle-es.png"/>
+                  <wp:docPr id="17" name="../../../images/scanner-not-your-aisle-es.png"/>
                   <a:graphic xmlns:a="http://schemas.openxmlformats.org/drawingml/2006/main">
                     <a:graphicData uri="http://schemas.openxmlformats.org/drawingml/2006/picture">
                       <pic:pic xmlns:pic="http://schemas.openxmlformats.org/drawingml/2006/picture">
                         <pic:nvPicPr>
-                          <pic:cNvPr id="14" name="../../../images/scanner-not-your-aisle-es.png"/>
+                          <pic:cNvPr id="17" name="../../../images/scanner-not-your-aisle-es.png"/>
                           <pic:cNvPicPr/>
                         </pic:nvPicPr>
                         <pic:blipFill>
-                          <a:blip r:embed="rIdImg14"/>
+                          <a:blip r:embed="rIdImg17"/>
                           <a:stretch>
                             <a:fillRect/>
                           </a:stretch>
@@ -4598,16 +4688,16 @@
         <w:drawing>
           <wp:inline distT="0" distB="0" distL="0" distR="0">
             <wp:extent cx="1035507" cy="2377440"/>
-            <wp:docPr id="15" name="../../../images/scanner-wrong-bin-es.png"/>
+            <wp:docPr id="18" name="../../../images/scanner-wrong-bin-es.png"/>
             <a:graphic xmlns:a="http://schemas.openxmlformats.org/drawingml/2006/main">
               <a:graphicData uri="http://schemas.openxmlformats.org/drawingml/2006/picture">
                 <pic:pic xmlns:pic="http://schemas.openxmlformats.org/drawingml/2006/picture">
                   <pic:nvPicPr>
-                    <pic:cNvPr id="15" name="../../../images/scanner-wrong-bin-es.png"/>
+                    <pic:cNvPr id="18" name="../../../images/scanner-wrong-bin-es.png"/>
                     <pic:cNvPicPr/>
                   </pic:nvPicPr>
                   <pic:blipFill>
-                    <a:blip r:embed="rIdImg15"/>
+                    <a:blip r:embed="rIdImg18"/>
                     <a:stretch>
                       <a:fillRect/>
                     </a:stretch>
@@ -4849,16 +4939,16 @@
         <w:drawing>
           <wp:inline distT="0" distB="0" distL="0" distR="0">
             <wp:extent cx="1035507" cy="2377440"/>
-            <wp:docPr id="16" name="../../../images/scanner-wrong-box-es.png"/>
+            <wp:docPr id="19" name="../../../images/scanner-wrong-box-es.png"/>
             <a:graphic xmlns:a="http://schemas.openxmlformats.org/drawingml/2006/main">
               <a:graphicData uri="http://schemas.openxmlformats.org/drawingml/2006/picture">
                 <pic:pic xmlns:pic="http://schemas.openxmlformats.org/drawingml/2006/picture">
                   <pic:nvPicPr>
-                    <pic:cNvPr id="16" name="../../../images/scanner-wrong-box-es.png"/>
+                    <pic:cNvPr id="19" name="../../../images/scanner-wrong-box-es.png"/>
                     <pic:cNvPicPr/>
                   </pic:nvPicPr>
                   <pic:blipFill>
-                    <a:blip r:embed="rIdImg16"/>
+                    <a:blip r:embed="rIdImg19"/>
                     <a:stretch>
                       <a:fillRect/>
                     </a:stretch>
@@ -5123,16 +5213,16 @@
         <w:drawing>
           <wp:inline distT="0" distB="0" distL="0" distR="0">
             <wp:extent cx="1035507" cy="2377440"/>
-            <wp:docPr id="17" name="../../../images/scanner-big-quantity-es.png"/>
+            <wp:docPr id="20" name="../../../images/scanner-big-quantity-es.png"/>
             <a:graphic xmlns:a="http://schemas.openxmlformats.org/drawingml/2006/main">
               <a:graphicData uri="http://schemas.openxmlformats.org/drawingml/2006/picture">
                 <pic:pic xmlns:pic="http://schemas.openxmlformats.org/drawingml/2006/picture">
                   <pic:nvPicPr>
-                    <pic:cNvPr id="17" name="../../../images/scanner-big-quantity-es.png"/>
+                    <pic:cNvPr id="20" name="../../../images/scanner-big-quantity-es.png"/>
                     <pic:cNvPicPr/>
                   </pic:nvPicPr>
                   <pic:blipFill>
-                    <a:blip r:embed="rIdImg17"/>
+                    <a:blip r:embed="rIdImg20"/>
                     <a:stretch>
                       <a:fillRect/>
                     </a:stretch>
@@ -5313,7 +5403,7 @@
           <w:sz w:val="40"/>
           <w:szCs w:val="40"/>
         </w:rPr>
-        <w:t xml:space="preserve">En el escáner — Un lote o una fecha de caducidad</w:t>
+        <w:t xml:space="preserve">En el escáner — Un lote o una fecha de vencimiento</w:t>
       </w:r>
     </w:p>
     <w:p>
@@ -5328,7 +5418,7 @@
         <w:t xml:space="preserve">Cuándo:</w:t>
       </w:r>
       <w:r>
-        <w:t xml:space="preserve"> el conteo pide también el lote o la fecha de caducidad</w:t>
+        <w:t xml:space="preserve"> el conteo pide también el lote o la fecha de vencimiento</w:t>
       </w:r>
     </w:p>
     <w:p>
@@ -5337,7 +5427,7 @@
         <w:jc w:val="left"/>
       </w:pPr>
       <w:r>
-        <w:t xml:space="preserve">Algunos conteos piden el lote y la caducidad de cada tarima. Los dos pueden faltar en una tarima real, así que los dos se pueden saltar.</w:t>
+        <w:t xml:space="preserve">Algunos conteos piden el lote y el vencimiento de cada tarima. Los dos pueden faltar en una tarima real, así que los dos se pueden saltar.</w:t>
       </w:r>
     </w:p>
     <w:p>
@@ -5377,7 +5467,7 @@
         <w:t xml:space="preserve">y</w:t>
       </w:r>
       <w:r>
-        <w:t xml:space="preserve"> Escribe la CADUCIDAD (AAAA-MM-DD).</w:t>
+        <w:t xml:space="preserve"> Escribe el VENCIMIENTO (AAAA-MM-DD).</w:t>
       </w:r>
     </w:p>
     <w:p>
@@ -5409,10 +5499,10 @@
         <w:rPr>
           <w:b/>
         </w:rPr>
-        <w:t xml:space="preserve">Lote</w:t>
-      </w:r>
-      <w:r>
-        <w:t xml:space="preserve">: escanea el código de lote de la etiqueta, o escríbelo. Sin lote: toca </w:t>
+        <w:t xml:space="preserve">Escanea el LOTE</w:t>
+      </w:r>
+      <w:r>
+        <w:t xml:space="preserve">: el código de lote de la etiqueta, o escríbelo. Sin lote: toca </w:t>
       </w:r>
       <w:r>
         <w:rPr>
@@ -5450,10 +5540,10 @@
         <w:rPr>
           <w:b/>
         </w:rPr>
-        <w:t xml:space="preserve">Caducidad</w:t>
-      </w:r>
-      <w:r>
-        <w:t xml:space="preserve">: escribe la fecha, por ejemplo 2027-03-15. Sin fecha: toca </w:t>
+        <w:t xml:space="preserve">Escribe el VENCIMIENTO</w:t>
+      </w:r>
+      <w:r>
+        <w:t xml:space="preserve">: la fecha, por ejemplo 2027-03-15. Sin fecha: toca </w:t>
       </w:r>
       <w:r>
         <w:rPr>
@@ -5500,7 +5590,7 @@
         <w:jc w:val="left"/>
       </w:pPr>
       <w:r>
-        <w:t xml:space="preserve">El lote y la caducidad de cada línea. Un lote que no coincide con el reporte, y una fecha vencida, quedan marcados.</w:t>
+        <w:t xml:space="preserve">El lote y el vencimiento de cada línea. Un lote que no coincide con el reporte, y una fecha vencida, quedan marcados.</w:t>
       </w:r>
     </w:p>
     <w:p>
@@ -5600,6 +5690,45 @@
           <w:szCs w:val="30"/>
         </w:rPr>
         <w:t xml:space="preserve">Lo que ves</w:t>
+      </w:r>
+    </w:p>
+    <w:p>
+      <w:pPr>
+        <w:spacing w:before="0" w:after="0"/>
+        <w:jc w:val="center"/>
+      </w:pPr>
+      <w:r>
+        <w:drawing>
+          <wp:inline distT="0" distB="0" distL="0" distR="0">
+            <wp:extent cx="1350662" cy="2377440"/>
+            <wp:docPr id="21" name="../../../images/scanner-film-comments-es.png"/>
+            <a:graphic xmlns:a="http://schemas.openxmlformats.org/drawingml/2006/main">
+              <a:graphicData uri="http://schemas.openxmlformats.org/drawingml/2006/picture">
+                <pic:pic xmlns:pic="http://schemas.openxmlformats.org/drawingml/2006/picture">
+                  <pic:nvPicPr>
+                    <pic:cNvPr id="21" name="../../../images/scanner-film-comments-es.png"/>
+                    <pic:cNvPicPr/>
+                  </pic:nvPicPr>
+                  <pic:blipFill>
+                    <a:blip r:embed="rIdImg21"/>
+                    <a:stretch>
+                      <a:fillRect/>
+                    </a:stretch>
+                  </pic:blipFill>
+                  <pic:spPr>
+                    <a:xfrm>
+                      <a:off x="0" y="0"/>
+                      <a:ext cx="1350662" cy="2377440"/>
+                    </a:xfrm>
+                    <a:prstGeom prst="rect">
+                      <a:avLst/>
+                    </a:prstGeom>
+                  </pic:spPr>
+                </pic:pic>
+              </a:graphicData>
+            </a:graphic>
+          </wp:inline>
+        </w:drawing>
       </w:r>
     </w:p>
     <w:p>
@@ -5881,16 +6010,16 @@
               <w:drawing>
                 <wp:inline distT="0" distB="0" distL="0" distR="0">
                   <wp:extent cx="1035507" cy="2377440"/>
-                  <wp:docPr id="18" name="../../../images/scanner-history-es.png"/>
+                  <wp:docPr id="22" name="../../../images/scanner-history-es.png"/>
                   <a:graphic xmlns:a="http://schemas.openxmlformats.org/drawingml/2006/main">
                     <a:graphicData uri="http://schemas.openxmlformats.org/drawingml/2006/picture">
                       <pic:pic xmlns:pic="http://schemas.openxmlformats.org/drawingml/2006/picture">
                         <pic:nvPicPr>
-                          <pic:cNvPr id="18" name="../../../images/scanner-history-es.png"/>
+                          <pic:cNvPr id="22" name="../../../images/scanner-history-es.png"/>
                           <pic:cNvPicPr/>
                         </pic:nvPicPr>
                         <pic:blipFill>
-                          <a:blip r:embed="rIdImg18"/>
+                          <a:blip r:embed="rIdImg22"/>
                           <a:stretch>
                             <a:fillRect/>
                           </a:stretch>
@@ -5940,16 +6069,16 @@
               <w:drawing>
                 <wp:inline distT="0" distB="0" distL="0" distR="0">
                   <wp:extent cx="1035507" cy="2377440"/>
-                  <wp:docPr id="19" name="../../../images/scanner-void-go-back-es.png"/>
+                  <wp:docPr id="23" name="../../../images/scanner-void-go-back-es.png"/>
                   <a:graphic xmlns:a="http://schemas.openxmlformats.org/drawingml/2006/main">
                     <a:graphicData uri="http://schemas.openxmlformats.org/drawingml/2006/picture">
                       <pic:pic xmlns:pic="http://schemas.openxmlformats.org/drawingml/2006/picture">
                         <pic:nvPicPr>
-                          <pic:cNvPr id="19" name="../../../images/scanner-void-go-back-es.png"/>
+                          <pic:cNvPr id="23" name="../../../images/scanner-void-go-back-es.png"/>
                           <pic:cNvPicPr/>
                         </pic:nvPicPr>
                         <pic:blipFill>
-                          <a:blip r:embed="rIdImg19"/>
+                          <a:blip r:embed="rIdImg23"/>
                           <a:stretch>
                             <a:fillRect/>
                           </a:stretch>
@@ -6286,6 +6415,45 @@
     </w:p>
     <w:p>
       <w:pPr>
+        <w:spacing w:before="0" w:after="0"/>
+        <w:jc w:val="center"/>
+      </w:pPr>
+      <w:r>
+        <w:drawing>
+          <wp:inline distT="0" distB="0" distL="0" distR="0">
+            <wp:extent cx="1350662" cy="2377440"/>
+            <wp:docPr id="24" name="../../../images/scanner-film-offline-es.png"/>
+            <a:graphic xmlns:a="http://schemas.openxmlformats.org/drawingml/2006/main">
+              <a:graphicData uri="http://schemas.openxmlformats.org/drawingml/2006/picture">
+                <pic:pic xmlns:pic="http://schemas.openxmlformats.org/drawingml/2006/picture">
+                  <pic:nvPicPr>
+                    <pic:cNvPr id="24" name="../../../images/scanner-film-offline-es.png"/>
+                    <pic:cNvPicPr/>
+                  </pic:nvPicPr>
+                  <pic:blipFill>
+                    <a:blip r:embed="rIdImg24"/>
+                    <a:stretch>
+                      <a:fillRect/>
+                    </a:stretch>
+                  </pic:blipFill>
+                  <pic:spPr>
+                    <a:xfrm>
+                      <a:off x="0" y="0"/>
+                      <a:ext cx="1350662" cy="2377440"/>
+                    </a:xfrm>
+                    <a:prstGeom prst="rect">
+                      <a:avLst/>
+                    </a:prstGeom>
+                  </pic:spPr>
+                </pic:pic>
+              </a:graphicData>
+            </a:graphic>
+          </wp:inline>
+        </w:drawing>
+      </w:r>
+    </w:p>
+    <w:p>
+      <w:pPr>
         <w:spacing w:before="0" w:after="200" w:line="240" w:lineRule="auto"/>
         <w:jc w:val="center"/>
       </w:pPr>
@@ -6542,6 +6710,45 @@
     </w:p>
     <w:p>
       <w:pPr>
+        <w:spacing w:before="0" w:after="0"/>
+        <w:jc w:val="center"/>
+      </w:pPr>
+      <w:r>
+        <w:drawing>
+          <wp:inline distT="0" distB="0" distL="0" distR="0">
+            <wp:extent cx="1350662" cy="2377440"/>
+            <wp:docPr id="25" name="../../../images/scanner-film-report-problem-es.png"/>
+            <a:graphic xmlns:a="http://schemas.openxmlformats.org/drawingml/2006/main">
+              <a:graphicData uri="http://schemas.openxmlformats.org/drawingml/2006/picture">
+                <pic:pic xmlns:pic="http://schemas.openxmlformats.org/drawingml/2006/picture">
+                  <pic:nvPicPr>
+                    <pic:cNvPr id="25" name="../../../images/scanner-film-report-problem-es.png"/>
+                    <pic:cNvPicPr/>
+                  </pic:nvPicPr>
+                  <pic:blipFill>
+                    <a:blip r:embed="rIdImg25"/>
+                    <a:stretch>
+                      <a:fillRect/>
+                    </a:stretch>
+                  </pic:blipFill>
+                  <pic:spPr>
+                    <a:xfrm>
+                      <a:off x="0" y="0"/>
+                      <a:ext cx="1350662" cy="2377440"/>
+                    </a:xfrm>
+                    <a:prstGeom prst="rect">
+                      <a:avLst/>
+                    </a:prstGeom>
+                  </pic:spPr>
+                </pic:pic>
+              </a:graphicData>
+            </a:graphic>
+          </wp:inline>
+        </w:drawing>
+      </w:r>
+    </w:p>
+    <w:p>
+      <w:pPr>
         <w:spacing w:before="0" w:after="200" w:line="240" w:lineRule="auto"/>
         <w:jc w:val="center"/>
       </w:pPr>
@@ -6700,10 +6907,10 @@
         <w:rPr>
           <w:b/>
         </w:rPr>
-        <w:t xml:space="preserve">Reportes → Lista de arreglos</w:t>
-      </w:r>
-      <w:r>
-        <w:t xml:space="preserve">, con la ubicación, la tarima, tu equipo y la hora. Alguien lo arregla y lo marca.</w:t>
+        <w:t xml:space="preserve">Reports → Fix list</w:t>
+      </w:r>
+      <w:r>
+        <w:t xml:space="preserve"> (la lista de arreglos), con la ubicación, la tarima, tu equipo y la hora. Alguien lo arregla y lo marca.</w:t>
       </w:r>
     </w:p>
     <w:p>
@@ -6825,11 +7032,41 @@
           </w:tcPr>
           <w:p>
             <w:pPr>
-              <w:spacing w:before="0" w:after="60" w:line="240" w:lineRule="auto"/>
-              <w:jc w:val="left"/>
+              <w:spacing w:before="0" w:after="0"/>
+              <w:jc w:val="center"/>
             </w:pPr>
             <w:r>
-              <w:t xml:space="preserve"/>
+              <w:drawing>
+                <wp:inline distT="0" distB="0" distL="0" distR="0">
+                  <wp:extent cx="1350662" cy="2377440"/>
+                  <wp:docPr id="26" name="../../../images/scanner-film-sos-list-es.png"/>
+                  <a:graphic xmlns:a="http://schemas.openxmlformats.org/drawingml/2006/main">
+                    <a:graphicData uri="http://schemas.openxmlformats.org/drawingml/2006/picture">
+                      <pic:pic xmlns:pic="http://schemas.openxmlformats.org/drawingml/2006/picture">
+                        <pic:nvPicPr>
+                          <pic:cNvPr id="26" name="../../../images/scanner-film-sos-list-es.png"/>
+                          <pic:cNvPicPr/>
+                        </pic:nvPicPr>
+                        <pic:blipFill>
+                          <a:blip r:embed="rIdImg26"/>
+                          <a:stretch>
+                            <a:fillRect/>
+                          </a:stretch>
+                        </pic:blipFill>
+                        <pic:spPr>
+                          <a:xfrm>
+                            <a:off x="0" y="0"/>
+                            <a:ext cx="1350662" cy="2377440"/>
+                          </a:xfrm>
+                          <a:prstGeom prst="rect">
+                            <a:avLst/>
+                          </a:prstGeom>
+                        </pic:spPr>
+                      </pic:pic>
+                    </a:graphicData>
+                  </a:graphic>
+                </wp:inline>
+              </w:drawing>
             </w:r>
           </w:p>
           <w:p>
@@ -6854,11 +7091,41 @@
           </w:tcPr>
           <w:p>
             <w:pPr>
-              <w:spacing w:before="0" w:after="60" w:line="240" w:lineRule="auto"/>
-              <w:jc w:val="left"/>
+              <w:spacing w:before="0" w:after="0"/>
+              <w:jc w:val="center"/>
             </w:pPr>
             <w:r>
-              <w:t xml:space="preserve"/>
+              <w:drawing>
+                <wp:inline distT="0" distB="0" distL="0" distR="0">
+                  <wp:extent cx="1350662" cy="2377440"/>
+                  <wp:docPr id="27" name="../../../images/scanner-film-sos-seen-es.png"/>
+                  <a:graphic xmlns:a="http://schemas.openxmlformats.org/drawingml/2006/main">
+                    <a:graphicData uri="http://schemas.openxmlformats.org/drawingml/2006/picture">
+                      <pic:pic xmlns:pic="http://schemas.openxmlformats.org/drawingml/2006/picture">
+                        <pic:nvPicPr>
+                          <pic:cNvPr id="27" name="../../../images/scanner-film-sos-seen-es.png"/>
+                          <pic:cNvPicPr/>
+                        </pic:nvPicPr>
+                        <pic:blipFill>
+                          <a:blip r:embed="rIdImg27"/>
+                          <a:stretch>
+                            <a:fillRect/>
+                          </a:stretch>
+                        </pic:blipFill>
+                        <pic:spPr>
+                          <a:xfrm>
+                            <a:off x="0" y="0"/>
+                            <a:ext cx="1350662" cy="2377440"/>
+                          </a:xfrm>
+                          <a:prstGeom prst="rect">
+                            <a:avLst/>
+                          </a:prstGeom>
+                        </pic:spPr>
+                      </pic:pic>
+                    </a:graphicData>
+                  </a:graphic>
+                </wp:inline>
+              </w:drawing>
             </w:r>
           </w:p>
           <w:p>
@@ -7118,6 +7385,45 @@
           <w:szCs w:val="30"/>
         </w:rPr>
         <w:t xml:space="preserve">Lo que ves</w:t>
+      </w:r>
+    </w:p>
+    <w:p>
+      <w:pPr>
+        <w:spacing w:before="0" w:after="0"/>
+        <w:jc w:val="center"/>
+      </w:pPr>
+      <w:r>
+        <w:drawing>
+          <wp:inline distT="0" distB="0" distL="0" distR="0">
+            <wp:extent cx="1350662" cy="2377440"/>
+            <wp:docPr id="28" name="../../../images/scanner-film-message-es.png"/>
+            <a:graphic xmlns:a="http://schemas.openxmlformats.org/drawingml/2006/main">
+              <a:graphicData uri="http://schemas.openxmlformats.org/drawingml/2006/picture">
+                <pic:pic xmlns:pic="http://schemas.openxmlformats.org/drawingml/2006/picture">
+                  <pic:nvPicPr>
+                    <pic:cNvPr id="28" name="../../../images/scanner-film-message-es.png"/>
+                    <pic:cNvPicPr/>
+                  </pic:nvPicPr>
+                  <pic:blipFill>
+                    <a:blip r:embed="rIdImg28"/>
+                    <a:stretch>
+                      <a:fillRect/>
+                    </a:stretch>
+                  </pic:blipFill>
+                  <pic:spPr>
+                    <a:xfrm>
+                      <a:off x="0" y="0"/>
+                      <a:ext cx="1350662" cy="2377440"/>
+                    </a:xfrm>
+                    <a:prstGeom prst="rect">
+                      <a:avLst/>
+                    </a:prstGeom>
+                  </pic:spPr>
+                </pic:pic>
+              </a:graphicData>
+            </a:graphic>
+          </wp:inline>
+        </w:drawing>
       </w:r>
     </w:p>
     <w:p>
@@ -7352,11 +7658,41 @@
           </w:tcPr>
           <w:p>
             <w:pPr>
-              <w:spacing w:before="0" w:after="60" w:line="240" w:lineRule="auto"/>
-              <w:jc w:val="left"/>
+              <w:spacing w:before="0" w:after="0"/>
+              <w:jc w:val="center"/>
             </w:pPr>
             <w:r>
-              <w:t xml:space="preserve"/>
+              <w:drawing>
+                <wp:inline distT="0" distB="0" distL="0" distR="0">
+                  <wp:extent cx="1350662" cy="2377440"/>
+                  <wp:docPr id="29" name="../../../images/scanner-film-second-counts-offered-es.png"/>
+                  <a:graphic xmlns:a="http://schemas.openxmlformats.org/drawingml/2006/main">
+                    <a:graphicData uri="http://schemas.openxmlformats.org/drawingml/2006/picture">
+                      <pic:pic xmlns:pic="http://schemas.openxmlformats.org/drawingml/2006/picture">
+                        <pic:nvPicPr>
+                          <pic:cNvPr id="29" name="../../../images/scanner-film-second-counts-offered-es.png"/>
+                          <pic:cNvPicPr/>
+                        </pic:nvPicPr>
+                        <pic:blipFill>
+                          <a:blip r:embed="rIdImg29"/>
+                          <a:stretch>
+                            <a:fillRect/>
+                          </a:stretch>
+                        </pic:blipFill>
+                        <pic:spPr>
+                          <a:xfrm>
+                            <a:off x="0" y="0"/>
+                            <a:ext cx="1350662" cy="2377440"/>
+                          </a:xfrm>
+                          <a:prstGeom prst="rect">
+                            <a:avLst/>
+                          </a:prstGeom>
+                        </pic:spPr>
+                      </pic:pic>
+                    </a:graphicData>
+                  </a:graphic>
+                </wp:inline>
+              </w:drawing>
             </w:r>
           </w:p>
           <w:p>
@@ -7381,11 +7717,41 @@
           </w:tcPr>
           <w:p>
             <w:pPr>
-              <w:spacing w:before="0" w:after="60" w:line="240" w:lineRule="auto"/>
-              <w:jc w:val="left"/>
+              <w:spacing w:before="0" w:after="0"/>
+              <w:jc w:val="center"/>
             </w:pPr>
             <w:r>
-              <w:t xml:space="preserve"/>
+              <w:drawing>
+                <wp:inline distT="0" distB="0" distL="0" distR="0">
+                  <wp:extent cx="1350662" cy="2377440"/>
+                  <wp:docPr id="30" name="../../../images/scanner-film-second-count-es.png"/>
+                  <a:graphic xmlns:a="http://schemas.openxmlformats.org/drawingml/2006/main">
+                    <a:graphicData uri="http://schemas.openxmlformats.org/drawingml/2006/picture">
+                      <pic:pic xmlns:pic="http://schemas.openxmlformats.org/drawingml/2006/picture">
+                        <pic:nvPicPr>
+                          <pic:cNvPr id="30" name="../../../images/scanner-film-second-count-es.png"/>
+                          <pic:cNvPicPr/>
+                        </pic:nvPicPr>
+                        <pic:blipFill>
+                          <a:blip r:embed="rIdImg30"/>
+                          <a:stretch>
+                            <a:fillRect/>
+                          </a:stretch>
+                        </pic:blipFill>
+                        <pic:spPr>
+                          <a:xfrm>
+                            <a:off x="0" y="0"/>
+                            <a:ext cx="1350662" cy="2377440"/>
+                          </a:xfrm>
+                          <a:prstGeom prst="rect">
+                            <a:avLst/>
+                          </a:prstGeom>
+                        </pic:spPr>
+                      </pic:pic>
+                    </a:graphicData>
+                  </a:graphic>
+                </wp:inline>
+              </w:drawing>
             </w:r>
           </w:p>
           <w:p>
@@ -7733,11 +8099,41 @@
           </w:tcPr>
           <w:p>
             <w:pPr>
-              <w:spacing w:before="0" w:after="60" w:line="240" w:lineRule="auto"/>
-              <w:jc w:val="left"/>
+              <w:spacing w:before="0" w:after="0"/>
+              <w:jc w:val="center"/>
             </w:pPr>
             <w:r>
-              <w:t xml:space="preserve"/>
+              <w:drawing>
+                <wp:inline distT="0" distB="0" distL="0" distR="0">
+                  <wp:extent cx="1350662" cy="2377440"/>
+                  <wp:docPr id="31" name="../../../images/scanner-film-aisle-complete-es.png"/>
+                  <a:graphic xmlns:a="http://schemas.openxmlformats.org/drawingml/2006/main">
+                    <a:graphicData uri="http://schemas.openxmlformats.org/drawingml/2006/picture">
+                      <pic:pic xmlns:pic="http://schemas.openxmlformats.org/drawingml/2006/picture">
+                        <pic:nvPicPr>
+                          <pic:cNvPr id="31" name="../../../images/scanner-film-aisle-complete-es.png"/>
+                          <pic:cNvPicPr/>
+                        </pic:nvPicPr>
+                        <pic:blipFill>
+                          <a:blip r:embed="rIdImg31"/>
+                          <a:stretch>
+                            <a:fillRect/>
+                          </a:stretch>
+                        </pic:blipFill>
+                        <pic:spPr>
+                          <a:xfrm>
+                            <a:off x="0" y="0"/>
+                            <a:ext cx="1350662" cy="2377440"/>
+                          </a:xfrm>
+                          <a:prstGeom prst="rect">
+                            <a:avLst/>
+                          </a:prstGeom>
+                        </pic:spPr>
+                      </pic:pic>
+                    </a:graphicData>
+                  </a:graphic>
+                </wp:inline>
+              </w:drawing>
             </w:r>
           </w:p>
           <w:p>
@@ -7762,11 +8158,41 @@
           </w:tcPr>
           <w:p>
             <w:pPr>
-              <w:spacing w:before="0" w:after="60" w:line="240" w:lineRule="auto"/>
-              <w:jc w:val="left"/>
+              <w:spacing w:before="0" w:after="0"/>
+              <w:jc w:val="center"/>
             </w:pPr>
             <w:r>
-              <w:t xml:space="preserve"/>
+              <w:drawing>
+                <wp:inline distT="0" distB="0" distL="0" distR="0">
+                  <wp:extent cx="1350662" cy="2377440"/>
+                  <wp:docPr id="32" name="../../../images/scanner-film-next-aisle-es.png"/>
+                  <a:graphic xmlns:a="http://schemas.openxmlformats.org/drawingml/2006/main">
+                    <a:graphicData uri="http://schemas.openxmlformats.org/drawingml/2006/picture">
+                      <pic:pic xmlns:pic="http://schemas.openxmlformats.org/drawingml/2006/picture">
+                        <pic:nvPicPr>
+                          <pic:cNvPr id="32" name="../../../images/scanner-film-next-aisle-es.png"/>
+                          <pic:cNvPicPr/>
+                        </pic:nvPicPr>
+                        <pic:blipFill>
+                          <a:blip r:embed="rIdImg32"/>
+                          <a:stretch>
+                            <a:fillRect/>
+                          </a:stretch>
+                        </pic:blipFill>
+                        <pic:spPr>
+                          <a:xfrm>
+                            <a:off x="0" y="0"/>
+                            <a:ext cx="1350662" cy="2377440"/>
+                          </a:xfrm>
+                          <a:prstGeom prst="rect">
+                            <a:avLst/>
+                          </a:prstGeom>
+                        </pic:spPr>
+                      </pic:pic>
+                    </a:graphicData>
+                  </a:graphic>
+                </wp:inline>
+              </w:drawing>
             </w:r>
           </w:p>
           <w:p>

</xml_diff>